<commit_message>
feat: assessmnet example, update repro plan docs
</commit_message>
<xml_diff>
--- a/static/repro_plan.docx
+++ b/static/repro_plan.docx
@@ -1,6 +1,6 @@
 
 <file path=word/document.xml><?xml version="1.0" encoding="utf-8"?>
-<w:document xmlns:wpc="http://schemas.microsoft.com/office/word/2010/wordprocessingCanvas" xmlns:cx="http://schemas.microsoft.com/office/drawing/2014/chartex" xmlns:cx1="http://schemas.microsoft.com/office/drawing/2015/9/8/chartex" xmlns:cx2="http://schemas.microsoft.com/office/drawing/2015/10/21/chartex" xmlns:cx3="http://schemas.microsoft.com/office/drawing/2016/5/9/chartex" xmlns:cx4="http://schemas.microsoft.com/office/drawing/2016/5/10/chartex" xmlns:cx5="http://schemas.microsoft.com/office/drawing/2016/5/11/chartex" xmlns:cx6="http://schemas.microsoft.com/office/drawing/2016/5/12/chartex" xmlns:cx7="http://schemas.microsoft.com/office/drawing/2016/5/13/chartex" xmlns:cx8="http://schemas.microsoft.com/office/drawing/2016/5/14/chartex" xmlns:mc="http://schemas.openxmlformats.org/markup-compatibility/2006" xmlns:aink="http://schemas.microsoft.com/office/drawing/2016/ink" xmlns:am3d="http://schemas.microsoft.com/office/drawing/2017/model3d" xmlns:o="urn:schemas-microsoft-com:office:office" xmlns:oel="http://schemas.microsoft.com/office/2019/extlst" xmlns:r="http://schemas.openxmlformats.org/officeDocument/2006/relationships" xmlns:m="http://schemas.openxmlformats.org/officeDocument/2006/math" xmlns:v="urn:schemas-microsoft-com:vml" xmlns:wp14="http://schemas.microsoft.com/office/word/2010/wordprocessingDrawing" xmlns:wp="http://schemas.openxmlformats.org/drawingml/2006/wordprocessingDrawing" xmlns:w10="urn:schemas-microsoft-com:office:word" xmlns:w="http://schemas.openxmlformats.org/wordprocessingml/2006/main" xmlns:w14="http://schemas.microsoft.com/office/word/2010/wordml" xmlns:w15="http://schemas.microsoft.com/office/word/2012/wordml" xmlns:w16cex="http://schemas.microsoft.com/office/word/2018/wordml/cex" xmlns:w16cid="http://schemas.microsoft.com/office/word/2016/wordml/cid" xmlns:w16="http://schemas.microsoft.com/office/word/2018/wordml" xmlns:w16sdtdh="http://schemas.microsoft.com/office/word/2020/wordml/sdtdatahash" xmlns:w16se="http://schemas.microsoft.com/office/word/2015/wordml/symex" xmlns:wpg="http://schemas.microsoft.com/office/word/2010/wordprocessingGroup" xmlns:wpi="http://schemas.microsoft.com/office/word/2010/wordprocessingInk" xmlns:wne="http://schemas.microsoft.com/office/word/2006/wordml" xmlns:wps="http://schemas.microsoft.com/office/word/2010/wordprocessingShape" mc:Ignorable="w14 w15 w16se w16cid w16 w16cex w16sdtdh wp14">
+<w:document xmlns:wpc="http://schemas.microsoft.com/office/word/2010/wordprocessingCanvas" xmlns:cx="http://schemas.microsoft.com/office/drawing/2014/chartex" xmlns:cx1="http://schemas.microsoft.com/office/drawing/2015/9/8/chartex" xmlns:cx2="http://schemas.microsoft.com/office/drawing/2015/10/21/chartex" xmlns:cx3="http://schemas.microsoft.com/office/drawing/2016/5/9/chartex" xmlns:cx4="http://schemas.microsoft.com/office/drawing/2016/5/10/chartex" xmlns:cx5="http://schemas.microsoft.com/office/drawing/2016/5/11/chartex" xmlns:cx6="http://schemas.microsoft.com/office/drawing/2016/5/12/chartex" xmlns:cx7="http://schemas.microsoft.com/office/drawing/2016/5/13/chartex" xmlns:cx8="http://schemas.microsoft.com/office/drawing/2016/5/14/chartex" xmlns:mc="http://schemas.openxmlformats.org/markup-compatibility/2006" xmlns:aink="http://schemas.microsoft.com/office/drawing/2016/ink" xmlns:am3d="http://schemas.microsoft.com/office/drawing/2017/model3d" xmlns:o="urn:schemas-microsoft-com:office:office" xmlns:oel="http://schemas.microsoft.com/office/2019/extlst" xmlns:r="http://schemas.openxmlformats.org/officeDocument/2006/relationships" xmlns:m="http://schemas.openxmlformats.org/officeDocument/2006/math" xmlns:v="urn:schemas-microsoft-com:vml" xmlns:wp14="http://schemas.microsoft.com/office/word/2010/wordprocessingDrawing" xmlns:wp="http://schemas.openxmlformats.org/drawingml/2006/wordprocessingDrawing" xmlns:w10="urn:schemas-microsoft-com:office:word" xmlns:w="http://schemas.openxmlformats.org/wordprocessingml/2006/main" xmlns:w14="http://schemas.microsoft.com/office/word/2010/wordml" xmlns:w15="http://schemas.microsoft.com/office/word/2012/wordml" xmlns:w16cex="http://schemas.microsoft.com/office/word/2018/wordml/cex" xmlns:w16cid="http://schemas.microsoft.com/office/word/2016/wordml/cid" xmlns:w16="http://schemas.microsoft.com/office/word/2018/wordml" xmlns:w16du="http://schemas.microsoft.com/office/word/2023/wordml/word16du" xmlns:w16sdtdh="http://schemas.microsoft.com/office/word/2020/wordml/sdtdatahash" xmlns:w16sdtfl="http://schemas.microsoft.com/office/word/2024/wordml/sdtformatlock" xmlns:w16se="http://schemas.microsoft.com/office/word/2015/wordml/symex" xmlns:wpg="http://schemas.microsoft.com/office/word/2010/wordprocessingGroup" xmlns:wpi="http://schemas.microsoft.com/office/word/2010/wordprocessingInk" xmlns:wne="http://schemas.microsoft.com/office/word/2006/wordml" xmlns:wps="http://schemas.microsoft.com/office/word/2010/wordprocessingShape" mc:Ignorable="w14 w15 w16se w16cid w16 w16cex w16sdtdh w16sdtfl w16du wp14">
   <w:body>
     <w:p>
       <w:pPr>
@@ -57,9 +57,8 @@
         <w:r>
           <w:rPr>
             <w:rStyle w:val="Hipervnculo"/>
-            <w:lang w:val="en-US"/>
           </w:rPr>
-          <w:t>https://cgranell.github.io/rrp/assessment.html</w:t>
+          <w:t>https://cgranell.github.io/orr/materials/02-assessment.html</w:t>
         </w:r>
       </w:hyperlink>
     </w:p>
@@ -73,29 +72,29 @@
       </w:pPr>
       <w:r>
         <w:rPr>
+          <w:b/>
+          <w:bCs/>
           <w:i/>
           <w:iCs/>
           <w:lang w:val="en-GB"/>
         </w:rPr>
-        <w:t xml:space="preserve">0 –undocumented; 1 – documented (i.e. </w:t>
-      </w:r>
-      <w:proofErr w:type="spellStart"/>
+        <w:t>U</w:t>
+      </w:r>
       <w:r>
         <w:rPr>
           <w:i/>
           <w:iCs/>
           <w:lang w:val="en-GB"/>
         </w:rPr>
-        <w:t>recreatable</w:t>
-      </w:r>
-      <w:proofErr w:type="spellEnd"/>
+        <w:t xml:space="preserve"> –</w:t>
+      </w:r>
       <w:r>
         <w:rPr>
           <w:i/>
           <w:iCs/>
           <w:lang w:val="en-GB"/>
         </w:rPr>
-        <w:t>);</w:t>
+        <w:t xml:space="preserve"> </w:t>
       </w:r>
       <w:r>
         <w:rPr>
@@ -103,15 +102,17 @@
           <w:iCs/>
           <w:lang w:val="en-GB"/>
         </w:rPr>
-        <w:t xml:space="preserve"> 2 – </w:t>
-      </w:r>
-      <w:r>
-        <w:rPr>
+        <w:t xml:space="preserve">undocumented; </w:t>
+      </w:r>
+      <w:r>
+        <w:rPr>
+          <w:b/>
+          <w:bCs/>
           <w:i/>
           <w:iCs/>
           <w:lang w:val="en-GB"/>
         </w:rPr>
-        <w:t>a</w:t>
+        <w:t>D</w:t>
       </w:r>
       <w:r>
         <w:rPr>
@@ -119,7 +120,101 @@
           <w:iCs/>
           <w:lang w:val="en-GB"/>
         </w:rPr>
-        <w:t xml:space="preserve">vailable; 3 – </w:t>
+        <w:t xml:space="preserve"> – documented (i.e. </w:t>
+      </w:r>
+      <w:proofErr w:type="spellStart"/>
+      <w:r>
+        <w:rPr>
+          <w:i/>
+          <w:iCs/>
+          <w:lang w:val="en-GB"/>
+        </w:rPr>
+        <w:t>recreatable</w:t>
+      </w:r>
+      <w:proofErr w:type="spellEnd"/>
+      <w:r>
+        <w:rPr>
+          <w:i/>
+          <w:iCs/>
+          <w:lang w:val="en-GB"/>
+        </w:rPr>
+        <w:t>);</w:t>
+      </w:r>
+      <w:r>
+        <w:rPr>
+          <w:i/>
+          <w:iCs/>
+          <w:lang w:val="en-GB"/>
+        </w:rPr>
+        <w:t xml:space="preserve"> </w:t>
+      </w:r>
+      <w:r>
+        <w:rPr>
+          <w:b/>
+          <w:bCs/>
+          <w:i/>
+          <w:iCs/>
+          <w:lang w:val="en-GB"/>
+        </w:rPr>
+        <w:t>A</w:t>
+      </w:r>
+      <w:r>
+        <w:rPr>
+          <w:i/>
+          <w:iCs/>
+          <w:lang w:val="en-GB"/>
+        </w:rPr>
+        <w:t xml:space="preserve"> – </w:t>
+      </w:r>
+      <w:r>
+        <w:rPr>
+          <w:i/>
+          <w:iCs/>
+          <w:lang w:val="en-GB"/>
+        </w:rPr>
+        <w:t xml:space="preserve">documented and </w:t>
+      </w:r>
+      <w:r>
+        <w:rPr>
+          <w:i/>
+          <w:iCs/>
+          <w:lang w:val="en-GB"/>
+        </w:rPr>
+        <w:t>a</w:t>
+      </w:r>
+      <w:r>
+        <w:rPr>
+          <w:i/>
+          <w:iCs/>
+          <w:lang w:val="en-GB"/>
+        </w:rPr>
+        <w:t xml:space="preserve">vailable; </w:t>
+      </w:r>
+      <w:r>
+        <w:rPr>
+          <w:b/>
+          <w:bCs/>
+          <w:i/>
+          <w:iCs/>
+          <w:lang w:val="en-GB"/>
+        </w:rPr>
+        <w:t>O</w:t>
+      </w:r>
+      <w:r>
+        <w:rPr>
+          <w:i/>
+          <w:iCs/>
+          <w:lang w:val="en-GB"/>
+        </w:rPr>
+        <w:t xml:space="preserve"> – </w:t>
+      </w:r>
+      <w:r>
+        <w:rPr>
+          <w:i/>
+          <w:iCs/>
+          <w:lang w:val="en-GB"/>
+        </w:rPr>
+        <w:t xml:space="preserve">documented, </w:t>
       </w:r>
       <w:r>
         <w:rPr>
@@ -369,33 +464,61 @@
             </w:pPr>
             <w:r>
               <w:rPr>
-                <w:i/>
-                <w:iCs/>
-                <w:lang w:val="en-US"/>
-              </w:rPr>
-              <w:t>2 because it is publicly available with a clear license and URL</w:t>
-            </w:r>
-          </w:p>
-        </w:tc>
-        <w:tc>
-          <w:tcPr>
-            <w:tcW w:w="5387" w:type="dxa"/>
-          </w:tcPr>
-          <w:p>
-            <w:pPr>
-              <w:rPr>
-                <w:i/>
-                <w:iCs/>
-                <w:lang w:val="en-US"/>
-              </w:rPr>
-            </w:pPr>
-            <w:r>
-              <w:rPr>
-                <w:i/>
-                <w:iCs/>
-                <w:lang w:val="en-US"/>
-              </w:rPr>
-              <w:t>None planned, because 2 is considered sufficient</w:t>
+                <w:b/>
+                <w:bCs/>
+                <w:i/>
+                <w:iCs/>
+                <w:lang w:val="en-US"/>
+              </w:rPr>
+              <w:t>A</w:t>
+            </w:r>
+            <w:r>
+              <w:rPr>
+                <w:i/>
+                <w:iCs/>
+                <w:lang w:val="en-US"/>
+              </w:rPr>
+              <w:t xml:space="preserve"> because it is publicly available with a clear license and URL</w:t>
+            </w:r>
+          </w:p>
+        </w:tc>
+        <w:tc>
+          <w:tcPr>
+            <w:tcW w:w="5387" w:type="dxa"/>
+          </w:tcPr>
+          <w:p>
+            <w:pPr>
+              <w:rPr>
+                <w:i/>
+                <w:iCs/>
+                <w:lang w:val="en-US"/>
+              </w:rPr>
+            </w:pPr>
+            <w:r>
+              <w:rPr>
+                <w:i/>
+                <w:iCs/>
+                <w:lang w:val="en-US"/>
+              </w:rPr>
+              <w:t xml:space="preserve">None planned, because </w:t>
+            </w:r>
+            <w:r>
+              <w:rPr>
+                <w:b/>
+                <w:bCs/>
+                <w:i/>
+                <w:iCs/>
+                <w:lang w:val="en-US"/>
+              </w:rPr>
+              <w:t>A</w:t>
+            </w:r>
+            <w:r>
+              <w:rPr>
+                <w:i/>
+                <w:iCs/>
+                <w:lang w:val="en-US"/>
+              </w:rPr>
+              <w:t xml:space="preserve"> is considered sufficient</w:t>
             </w:r>
           </w:p>
         </w:tc>
@@ -502,7 +625,7 @@
           <w:u w:val="single"/>
           <w:lang w:val="en-US"/>
         </w:rPr>
-        <w:t>Methods</w:t>
+        <w:t>Methods, Analysis, Processing</w:t>
       </w:r>
     </w:p>
     <w:tbl>
@@ -665,11 +788,21 @@
             </w:pPr>
             <w:r>
               <w:rPr>
-                <w:i/>
-                <w:iCs/>
-                <w:lang w:val="en-US"/>
-              </w:rPr>
-              <w:t xml:space="preserve">0 because parameters (e.g. K) and software environment not </w:t>
+                <w:b/>
+                <w:bCs/>
+                <w:i/>
+                <w:iCs/>
+                <w:lang w:val="en-US"/>
+              </w:rPr>
+              <w:t>U</w:t>
+            </w:r>
+            <w:r>
+              <w:rPr>
+                <w:i/>
+                <w:iCs/>
+                <w:lang w:val="en-US"/>
+              </w:rPr>
+              <w:t xml:space="preserve"> because parameters (e.g. K) and software environment not </w:t>
             </w:r>
             <w:r>
               <w:rPr>
@@ -725,7 +858,25 @@
                 <w:iCs/>
                 <w:lang w:val="en-US"/>
               </w:rPr>
-              <w:t>, target level 2 (no DOI, but open source, publicly available)</w:t>
+              <w:t xml:space="preserve">, target level </w:t>
+            </w:r>
+            <w:r>
+              <w:rPr>
+                <w:b/>
+                <w:bCs/>
+                <w:i/>
+                <w:iCs/>
+                <w:lang w:val="en-US"/>
+              </w:rPr>
+              <w:t>A</w:t>
+            </w:r>
+            <w:r>
+              <w:rPr>
+                <w:i/>
+                <w:iCs/>
+                <w:lang w:val="en-US"/>
+              </w:rPr>
+              <w:t xml:space="preserve"> (no DOI, but open source, publicly available)</w:t>
             </w:r>
           </w:p>
         </w:tc>
@@ -996,33 +1147,61 @@
             </w:pPr>
             <w:r>
               <w:rPr>
-                <w:i/>
-                <w:iCs/>
-                <w:lang w:val="en-US"/>
-              </w:rPr>
-              <w:t>0 because nothing is yet defined</w:t>
-            </w:r>
-          </w:p>
-        </w:tc>
-        <w:tc>
-          <w:tcPr>
-            <w:tcW w:w="5387" w:type="dxa"/>
-          </w:tcPr>
-          <w:p>
-            <w:pPr>
-              <w:rPr>
-                <w:i/>
-                <w:iCs/>
-                <w:lang w:val="en-US"/>
-              </w:rPr>
-            </w:pPr>
-            <w:r>
-              <w:rPr>
-                <w:i/>
-                <w:iCs/>
-                <w:lang w:val="en-US"/>
-              </w:rPr>
-              <w:t>Publish interactive web map including underlying data set, target level 2 (no DOI, but users can investigate outcomes fully, publicly available)</w:t>
+                <w:b/>
+                <w:bCs/>
+                <w:i/>
+                <w:iCs/>
+                <w:lang w:val="en-US"/>
+              </w:rPr>
+              <w:t>U</w:t>
+            </w:r>
+            <w:r>
+              <w:rPr>
+                <w:i/>
+                <w:iCs/>
+                <w:lang w:val="en-US"/>
+              </w:rPr>
+              <w:t xml:space="preserve"> because nothing is yet defined</w:t>
+            </w:r>
+          </w:p>
+        </w:tc>
+        <w:tc>
+          <w:tcPr>
+            <w:tcW w:w="5387" w:type="dxa"/>
+          </w:tcPr>
+          <w:p>
+            <w:pPr>
+              <w:rPr>
+                <w:i/>
+                <w:iCs/>
+                <w:lang w:val="en-US"/>
+              </w:rPr>
+            </w:pPr>
+            <w:r>
+              <w:rPr>
+                <w:i/>
+                <w:iCs/>
+                <w:lang w:val="en-US"/>
+              </w:rPr>
+              <w:t xml:space="preserve">Publish interactive web map including underlying data set, target level </w:t>
+            </w:r>
+            <w:r>
+              <w:rPr>
+                <w:b/>
+                <w:bCs/>
+                <w:i/>
+                <w:iCs/>
+                <w:lang w:val="en-US"/>
+              </w:rPr>
+              <w:t>A</w:t>
+            </w:r>
+            <w:r>
+              <w:rPr>
+                <w:i/>
+                <w:iCs/>
+                <w:lang w:val="en-US"/>
+              </w:rPr>
+              <w:t xml:space="preserve"> (no DOI, but users can investigate outcomes fully, publicly available)</w:t>
             </w:r>
           </w:p>
         </w:tc>
@@ -1250,7 +1429,7 @@
 </file>
 
 <file path=word/endnotes.xml><?xml version="1.0" encoding="utf-8"?>
-<w:endnotes xmlns:wpc="http://schemas.microsoft.com/office/word/2010/wordprocessingCanvas" xmlns:cx="http://schemas.microsoft.com/office/drawing/2014/chartex" xmlns:cx1="http://schemas.microsoft.com/office/drawing/2015/9/8/chartex" xmlns:cx2="http://schemas.microsoft.com/office/drawing/2015/10/21/chartex" xmlns:cx3="http://schemas.microsoft.com/office/drawing/2016/5/9/chartex" xmlns:cx4="http://schemas.microsoft.com/office/drawing/2016/5/10/chartex" xmlns:cx5="http://schemas.microsoft.com/office/drawing/2016/5/11/chartex" xmlns:cx6="http://schemas.microsoft.com/office/drawing/2016/5/12/chartex" xmlns:cx7="http://schemas.microsoft.com/office/drawing/2016/5/13/chartex" xmlns:cx8="http://schemas.microsoft.com/office/drawing/2016/5/14/chartex" xmlns:mc="http://schemas.openxmlformats.org/markup-compatibility/2006" xmlns:aink="http://schemas.microsoft.com/office/drawing/2016/ink" xmlns:am3d="http://schemas.microsoft.com/office/drawing/2017/model3d" xmlns:o="urn:schemas-microsoft-com:office:office" xmlns:oel="http://schemas.microsoft.com/office/2019/extlst" xmlns:r="http://schemas.openxmlformats.org/officeDocument/2006/relationships" xmlns:m="http://schemas.openxmlformats.org/officeDocument/2006/math" xmlns:v="urn:schemas-microsoft-com:vml" xmlns:wp14="http://schemas.microsoft.com/office/word/2010/wordprocessingDrawing" xmlns:wp="http://schemas.openxmlformats.org/drawingml/2006/wordprocessingDrawing" xmlns:w10="urn:schemas-microsoft-com:office:word" xmlns:w="http://schemas.openxmlformats.org/wordprocessingml/2006/main" xmlns:w14="http://schemas.microsoft.com/office/word/2010/wordml" xmlns:w15="http://schemas.microsoft.com/office/word/2012/wordml" xmlns:w16cex="http://schemas.microsoft.com/office/word/2018/wordml/cex" xmlns:w16cid="http://schemas.microsoft.com/office/word/2016/wordml/cid" xmlns:w16="http://schemas.microsoft.com/office/word/2018/wordml" xmlns:w16sdtdh="http://schemas.microsoft.com/office/word/2020/wordml/sdtdatahash" xmlns:w16se="http://schemas.microsoft.com/office/word/2015/wordml/symex" xmlns:wpg="http://schemas.microsoft.com/office/word/2010/wordprocessingGroup" xmlns:wpi="http://schemas.microsoft.com/office/word/2010/wordprocessingInk" xmlns:wne="http://schemas.microsoft.com/office/word/2006/wordml" xmlns:wps="http://schemas.microsoft.com/office/word/2010/wordprocessingShape" mc:Ignorable="w14 w15 w16se w16cid w16 w16cex w16sdtdh wp14">
+<w:endnotes xmlns:wpc="http://schemas.microsoft.com/office/word/2010/wordprocessingCanvas" xmlns:cx="http://schemas.microsoft.com/office/drawing/2014/chartex" xmlns:cx1="http://schemas.microsoft.com/office/drawing/2015/9/8/chartex" xmlns:cx2="http://schemas.microsoft.com/office/drawing/2015/10/21/chartex" xmlns:cx3="http://schemas.microsoft.com/office/drawing/2016/5/9/chartex" xmlns:cx4="http://schemas.microsoft.com/office/drawing/2016/5/10/chartex" xmlns:cx5="http://schemas.microsoft.com/office/drawing/2016/5/11/chartex" xmlns:cx6="http://schemas.microsoft.com/office/drawing/2016/5/12/chartex" xmlns:cx7="http://schemas.microsoft.com/office/drawing/2016/5/13/chartex" xmlns:cx8="http://schemas.microsoft.com/office/drawing/2016/5/14/chartex" xmlns:mc="http://schemas.openxmlformats.org/markup-compatibility/2006" xmlns:aink="http://schemas.microsoft.com/office/drawing/2016/ink" xmlns:am3d="http://schemas.microsoft.com/office/drawing/2017/model3d" xmlns:o="urn:schemas-microsoft-com:office:office" xmlns:oel="http://schemas.microsoft.com/office/2019/extlst" xmlns:r="http://schemas.openxmlformats.org/officeDocument/2006/relationships" xmlns:m="http://schemas.openxmlformats.org/officeDocument/2006/math" xmlns:v="urn:schemas-microsoft-com:vml" xmlns:wp14="http://schemas.microsoft.com/office/word/2010/wordprocessingDrawing" xmlns:wp="http://schemas.openxmlformats.org/drawingml/2006/wordprocessingDrawing" xmlns:w10="urn:schemas-microsoft-com:office:word" xmlns:w="http://schemas.openxmlformats.org/wordprocessingml/2006/main" xmlns:w14="http://schemas.microsoft.com/office/word/2010/wordml" xmlns:w15="http://schemas.microsoft.com/office/word/2012/wordml" xmlns:w16cex="http://schemas.microsoft.com/office/word/2018/wordml/cex" xmlns:w16cid="http://schemas.microsoft.com/office/word/2016/wordml/cid" xmlns:w16="http://schemas.microsoft.com/office/word/2018/wordml" xmlns:w16du="http://schemas.microsoft.com/office/word/2023/wordml/word16du" xmlns:w16sdtdh="http://schemas.microsoft.com/office/word/2020/wordml/sdtdatahash" xmlns:w16sdtfl="http://schemas.microsoft.com/office/word/2024/wordml/sdtformatlock" xmlns:w16se="http://schemas.microsoft.com/office/word/2015/wordml/symex" xmlns:wpg="http://schemas.microsoft.com/office/word/2010/wordprocessingGroup" xmlns:wpi="http://schemas.microsoft.com/office/word/2010/wordprocessingInk" xmlns:wne="http://schemas.microsoft.com/office/word/2006/wordml" xmlns:wps="http://schemas.microsoft.com/office/word/2010/wordprocessingShape" mc:Ignorable="w14 w15 w16se w16cid w16 w16cex w16sdtdh w16sdtfl w16du wp14">
   <w:endnote w:type="separator" w:id="-1">
     <w:p>
       <w:pPr>
@@ -1275,7 +1454,7 @@
 </file>
 
 <file path=word/footnotes.xml><?xml version="1.0" encoding="utf-8"?>
-<w:footnotes xmlns:wpc="http://schemas.microsoft.com/office/word/2010/wordprocessingCanvas" xmlns:cx="http://schemas.microsoft.com/office/drawing/2014/chartex" xmlns:cx1="http://schemas.microsoft.com/office/drawing/2015/9/8/chartex" xmlns:cx2="http://schemas.microsoft.com/office/drawing/2015/10/21/chartex" xmlns:cx3="http://schemas.microsoft.com/office/drawing/2016/5/9/chartex" xmlns:cx4="http://schemas.microsoft.com/office/drawing/2016/5/10/chartex" xmlns:cx5="http://schemas.microsoft.com/office/drawing/2016/5/11/chartex" xmlns:cx6="http://schemas.microsoft.com/office/drawing/2016/5/12/chartex" xmlns:cx7="http://schemas.microsoft.com/office/drawing/2016/5/13/chartex" xmlns:cx8="http://schemas.microsoft.com/office/drawing/2016/5/14/chartex" xmlns:mc="http://schemas.openxmlformats.org/markup-compatibility/2006" xmlns:aink="http://schemas.microsoft.com/office/drawing/2016/ink" xmlns:am3d="http://schemas.microsoft.com/office/drawing/2017/model3d" xmlns:o="urn:schemas-microsoft-com:office:office" xmlns:oel="http://schemas.microsoft.com/office/2019/extlst" xmlns:r="http://schemas.openxmlformats.org/officeDocument/2006/relationships" xmlns:m="http://schemas.openxmlformats.org/officeDocument/2006/math" xmlns:v="urn:schemas-microsoft-com:vml" xmlns:wp14="http://schemas.microsoft.com/office/word/2010/wordprocessingDrawing" xmlns:wp="http://schemas.openxmlformats.org/drawingml/2006/wordprocessingDrawing" xmlns:w10="urn:schemas-microsoft-com:office:word" xmlns:w="http://schemas.openxmlformats.org/wordprocessingml/2006/main" xmlns:w14="http://schemas.microsoft.com/office/word/2010/wordml" xmlns:w15="http://schemas.microsoft.com/office/word/2012/wordml" xmlns:w16cex="http://schemas.microsoft.com/office/word/2018/wordml/cex" xmlns:w16cid="http://schemas.microsoft.com/office/word/2016/wordml/cid" xmlns:w16="http://schemas.microsoft.com/office/word/2018/wordml" xmlns:w16sdtdh="http://schemas.microsoft.com/office/word/2020/wordml/sdtdatahash" xmlns:w16se="http://schemas.microsoft.com/office/word/2015/wordml/symex" xmlns:wpg="http://schemas.microsoft.com/office/word/2010/wordprocessingGroup" xmlns:wpi="http://schemas.microsoft.com/office/word/2010/wordprocessingInk" xmlns:wne="http://schemas.microsoft.com/office/word/2006/wordml" xmlns:wps="http://schemas.microsoft.com/office/word/2010/wordprocessingShape" mc:Ignorable="w14 w15 w16se w16cid w16 w16cex w16sdtdh wp14">
+<w:footnotes xmlns:wpc="http://schemas.microsoft.com/office/word/2010/wordprocessingCanvas" xmlns:cx="http://schemas.microsoft.com/office/drawing/2014/chartex" xmlns:cx1="http://schemas.microsoft.com/office/drawing/2015/9/8/chartex" xmlns:cx2="http://schemas.microsoft.com/office/drawing/2015/10/21/chartex" xmlns:cx3="http://schemas.microsoft.com/office/drawing/2016/5/9/chartex" xmlns:cx4="http://schemas.microsoft.com/office/drawing/2016/5/10/chartex" xmlns:cx5="http://schemas.microsoft.com/office/drawing/2016/5/11/chartex" xmlns:cx6="http://schemas.microsoft.com/office/drawing/2016/5/12/chartex" xmlns:cx7="http://schemas.microsoft.com/office/drawing/2016/5/13/chartex" xmlns:cx8="http://schemas.microsoft.com/office/drawing/2016/5/14/chartex" xmlns:mc="http://schemas.openxmlformats.org/markup-compatibility/2006" xmlns:aink="http://schemas.microsoft.com/office/drawing/2016/ink" xmlns:am3d="http://schemas.microsoft.com/office/drawing/2017/model3d" xmlns:o="urn:schemas-microsoft-com:office:office" xmlns:oel="http://schemas.microsoft.com/office/2019/extlst" xmlns:r="http://schemas.openxmlformats.org/officeDocument/2006/relationships" xmlns:m="http://schemas.openxmlformats.org/officeDocument/2006/math" xmlns:v="urn:schemas-microsoft-com:vml" xmlns:wp14="http://schemas.microsoft.com/office/word/2010/wordprocessingDrawing" xmlns:wp="http://schemas.openxmlformats.org/drawingml/2006/wordprocessingDrawing" xmlns:w10="urn:schemas-microsoft-com:office:word" xmlns:w="http://schemas.openxmlformats.org/wordprocessingml/2006/main" xmlns:w14="http://schemas.microsoft.com/office/word/2010/wordml" xmlns:w15="http://schemas.microsoft.com/office/word/2012/wordml" xmlns:w16cex="http://schemas.microsoft.com/office/word/2018/wordml/cex" xmlns:w16cid="http://schemas.microsoft.com/office/word/2016/wordml/cid" xmlns:w16="http://schemas.microsoft.com/office/word/2018/wordml" xmlns:w16du="http://schemas.microsoft.com/office/word/2023/wordml/word16du" xmlns:w16sdtdh="http://schemas.microsoft.com/office/word/2020/wordml/sdtdatahash" xmlns:w16sdtfl="http://schemas.microsoft.com/office/word/2024/wordml/sdtformatlock" xmlns:w16se="http://schemas.microsoft.com/office/word/2015/wordml/symex" xmlns:wpg="http://schemas.microsoft.com/office/word/2010/wordprocessingGroup" xmlns:wpi="http://schemas.microsoft.com/office/word/2010/wordprocessingInk" xmlns:wne="http://schemas.microsoft.com/office/word/2006/wordml" xmlns:wps="http://schemas.microsoft.com/office/word/2010/wordprocessingShape" mc:Ignorable="w14 w15 w16se w16cid w16 w16cex w16sdtdh w16sdtfl w16du wp14">
   <w:footnote w:type="separator" w:id="-1">
     <w:p>
       <w:pPr>
@@ -1300,7 +1479,7 @@
 </file>
 
 <file path=word/styles.xml><?xml version="1.0" encoding="utf-8"?>
-<w:styles xmlns:mc="http://schemas.openxmlformats.org/markup-compatibility/2006" xmlns:r="http://schemas.openxmlformats.org/officeDocument/2006/relationships" xmlns:w="http://schemas.openxmlformats.org/wordprocessingml/2006/main" xmlns:w14="http://schemas.microsoft.com/office/word/2010/wordml" xmlns:w15="http://schemas.microsoft.com/office/word/2012/wordml" xmlns:w16cex="http://schemas.microsoft.com/office/word/2018/wordml/cex" xmlns:w16cid="http://schemas.microsoft.com/office/word/2016/wordml/cid" xmlns:w16="http://schemas.microsoft.com/office/word/2018/wordml" xmlns:w16sdtdh="http://schemas.microsoft.com/office/word/2020/wordml/sdtdatahash" xmlns:w16se="http://schemas.microsoft.com/office/word/2015/wordml/symex" mc:Ignorable="w14 w15 w16se w16cid w16 w16cex w16sdtdh">
+<w:styles xmlns:mc="http://schemas.openxmlformats.org/markup-compatibility/2006" xmlns:r="http://schemas.openxmlformats.org/officeDocument/2006/relationships" xmlns:w="http://schemas.openxmlformats.org/wordprocessingml/2006/main" xmlns:w14="http://schemas.microsoft.com/office/word/2010/wordml" xmlns:w15="http://schemas.microsoft.com/office/word/2012/wordml" xmlns:w16cex="http://schemas.microsoft.com/office/word/2018/wordml/cex" xmlns:w16cid="http://schemas.microsoft.com/office/word/2016/wordml/cid" xmlns:w16="http://schemas.microsoft.com/office/word/2018/wordml" xmlns:w16du="http://schemas.microsoft.com/office/word/2023/wordml/word16du" xmlns:w16sdtdh="http://schemas.microsoft.com/office/word/2020/wordml/sdtdatahash" xmlns:w16sdtfl="http://schemas.microsoft.com/office/word/2024/wordml/sdtformatlock" xmlns:w16se="http://schemas.microsoft.com/office/word/2015/wordml/symex" mc:Ignorable="w14 w15 w16se w16cid w16 w16cex w16sdtdh w16sdtfl w16du">
   <w:docDefaults>
     <w:rPrDefault>
       <w:rPr>

</xml_diff>